<commit_message>
updated for multiple unique keys in db
</commit_message>
<xml_diff>
--- a/system Architecture.docx
+++ b/system Architecture.docx
@@ -1,6 +1,6 @@
 
 <file path=word/document.xml><?xml version="1.0" encoding="utf-8"?>
-<w:document xmlns:wpc="http://schemas.microsoft.com/office/word/2010/wordprocessingCanvas" xmlns:cx="http://schemas.microsoft.com/office/drawing/2014/chartex" xmlns:cx1="http://schemas.microsoft.com/office/drawing/2015/9/8/chartex" xmlns:cx2="http://schemas.microsoft.com/office/drawing/2015/10/21/chartex" xmlns:cx3="http://schemas.microsoft.com/office/drawing/2016/5/9/chartex" xmlns:cx4="http://schemas.microsoft.com/office/drawing/2016/5/10/chartex" xmlns:cx5="http://schemas.microsoft.com/office/drawing/2016/5/11/chartex" xmlns:cx6="http://schemas.microsoft.com/office/drawing/2016/5/12/chartex" xmlns:cx7="http://schemas.microsoft.com/office/drawing/2016/5/13/chartex" xmlns:cx8="http://schemas.microsoft.com/office/drawing/2016/5/14/chartex" xmlns:mc="http://schemas.openxmlformats.org/markup-compatibility/2006" xmlns:aink="http://schemas.microsoft.com/office/drawing/2016/ink" xmlns:am3d="http://schemas.microsoft.com/office/drawing/2017/model3d" xmlns:o="urn:schemas-microsoft-com:office:office" xmlns:oel="http://schemas.microsoft.com/office/2019/extlst" xmlns:r="http://schemas.openxmlformats.org/officeDocument/2006/relationships" xmlns:m="http://schemas.openxmlformats.org/officeDocument/2006/math" xmlns:v="urn:schemas-microsoft-com:vml" xmlns:wp14="http://schemas.microsoft.com/office/word/2010/wordprocessingDrawing" xmlns:wp="http://schemas.openxmlformats.org/drawingml/2006/wordprocessingDrawing" xmlns:w10="urn:schemas-microsoft-com:office:word" xmlns:w="http://schemas.openxmlformats.org/wordprocessingml/2006/main" xmlns:w14="http://schemas.microsoft.com/office/word/2010/wordml" xmlns:w15="http://schemas.microsoft.com/office/word/2012/wordml" xmlns:w16cex="http://schemas.microsoft.com/office/word/2018/wordml/cex" xmlns:w16cid="http://schemas.microsoft.com/office/word/2016/wordml/cid" xmlns:w16="http://schemas.microsoft.com/office/word/2018/wordml" xmlns:w16du="http://schemas.microsoft.com/office/word/2023/wordml/word16du" xmlns:w16sdtdh="http://schemas.microsoft.com/office/word/2020/wordml/sdtdatahash" xmlns:w16se="http://schemas.microsoft.com/office/word/2015/wordml/symex" xmlns:wpg="http://schemas.microsoft.com/office/word/2010/wordprocessingGroup" xmlns:wpi="http://schemas.microsoft.com/office/word/2010/wordprocessingInk" xmlns:wne="http://schemas.microsoft.com/office/word/2006/wordml" xmlns:wps="http://schemas.microsoft.com/office/word/2010/wordprocessingShape" mc:Ignorable="w14 w15 w16se w16cid w16 w16cex w16sdtdh w16du wp14">
+<w:document xmlns:wpc="http://schemas.microsoft.com/office/word/2010/wordprocessingCanvas" xmlns:cx="http://schemas.microsoft.com/office/drawing/2014/chartex" xmlns:cx1="http://schemas.microsoft.com/office/drawing/2015/9/8/chartex" xmlns:cx2="http://schemas.microsoft.com/office/drawing/2015/10/21/chartex" xmlns:cx3="http://schemas.microsoft.com/office/drawing/2016/5/9/chartex" xmlns:cx4="http://schemas.microsoft.com/office/drawing/2016/5/10/chartex" xmlns:cx5="http://schemas.microsoft.com/office/drawing/2016/5/11/chartex" xmlns:cx6="http://schemas.microsoft.com/office/drawing/2016/5/12/chartex" xmlns:cx7="http://schemas.microsoft.com/office/drawing/2016/5/13/chartex" xmlns:cx8="http://schemas.microsoft.com/office/drawing/2016/5/14/chartex" xmlns:mc="http://schemas.openxmlformats.org/markup-compatibility/2006" xmlns:aink="http://schemas.microsoft.com/office/drawing/2016/ink" xmlns:am3d="http://schemas.microsoft.com/office/drawing/2017/model3d" xmlns:o="urn:schemas-microsoft-com:office:office" xmlns:r="http://schemas.openxmlformats.org/officeDocument/2006/relationships" xmlns:m="http://schemas.openxmlformats.org/officeDocument/2006/math" xmlns:v="urn:schemas-microsoft-com:vml" xmlns:wp14="http://schemas.microsoft.com/office/word/2010/wordprocessingDrawing" xmlns:wp="http://schemas.openxmlformats.org/drawingml/2006/wordprocessingDrawing" xmlns:w10="urn:schemas-microsoft-com:office:word" xmlns:w="http://schemas.openxmlformats.org/wordprocessingml/2006/main" xmlns:w14="http://schemas.microsoft.com/office/word/2010/wordml" xmlns:w15="http://schemas.microsoft.com/office/word/2012/wordml" xmlns:w16cid="http://schemas.microsoft.com/office/word/2016/wordml/cid" xmlns:w16se="http://schemas.microsoft.com/office/word/2015/wordml/symex" xmlns:wpg="http://schemas.microsoft.com/office/word/2010/wordprocessingGroup" xmlns:wpi="http://schemas.microsoft.com/office/word/2010/wordprocessingInk" xmlns:wne="http://schemas.microsoft.com/office/word/2006/wordml" xmlns:wps="http://schemas.microsoft.com/office/word/2010/wordprocessingShape" mc:Ignorable="w14 w15 w16se w16cid wp14">
   <w:body>
     <w:p>
       <w:pPr>
@@ -85,7 +85,7 @@
     <w:p>
       <w:r>
         <w:pict w14:anchorId="79C8157F">
-          <v:rect id="_x0000_i1121" style="width:384.85pt;height:1.5pt" o:hrpct="0" o:hralign="center" o:hrstd="t" o:hr="t" fillcolor="#a0a0a0" stroked="f"/>
+          <v:rect id="_x0000_i1025" style="width:384.85pt;height:1.5pt" o:hrpct="0" o:hralign="center" o:hrstd="t" o:hr="t" fillcolor="#a0a0a0" stroked="f"/>
         </w:pict>
       </w:r>
     </w:p>
@@ -703,7 +703,7 @@
     <w:p>
       <w:r>
         <w:pict w14:anchorId="0BEDB4A8">
-          <v:rect id="_x0000_i1122" style="width:384.85pt;height:1.5pt" o:hrpct="0" o:hralign="center" o:hrstd="t" o:hr="t" fillcolor="#a0a0a0" stroked="f"/>
+          <v:rect id="_x0000_i1026" style="width:384.85pt;height:1.5pt" o:hrpct="0" o:hralign="center" o:hrstd="t" o:hr="t" fillcolor="#a0a0a0" stroked="f"/>
         </w:pict>
       </w:r>
     </w:p>
@@ -4089,7 +4089,7 @@
     <w:p>
       <w:r>
         <w:pict w14:anchorId="39384CE6">
-          <v:rect id="_x0000_i1132" style="width:384.85pt;height:1.5pt" o:hrpct="0" o:hralign="center" o:hrstd="t" o:hr="t" fillcolor="#a0a0a0" stroked="f"/>
+          <v:rect id="_x0000_i1027" style="width:384.85pt;height:1.5pt" o:hrpct="0" o:hralign="center" o:hrstd="t" o:hr="t" fillcolor="#a0a0a0" stroked="f"/>
         </w:pict>
       </w:r>
     </w:p>
@@ -4289,17 +4289,11 @@
       </w:r>
       <w:proofErr w:type="gramStart"/>
       <w:r>
-        <w:t>(</w:t>
-      </w:r>
-      <w:r>
-        <w:t>./</w:t>
+        <w:t>(./</w:t>
       </w:r>
       <w:proofErr w:type="gramEnd"/>
       <w:r>
-        <w:t>uploads/photos./uploads/certificates</w:t>
-      </w:r>
-      <w:r>
-        <w:t>)</w:t>
+        <w:t>uploads/photos./uploads/certificates)</w:t>
       </w:r>
     </w:p>
     <w:p>
@@ -4321,13 +4315,7 @@
         <w:t xml:space="preserve"> Redis</w:t>
       </w:r>
       <w:r>
-        <w:t xml:space="preserve"> </w:t>
-      </w:r>
-      <w:r>
-        <w:t>for due-date calculations and session management</w:t>
-      </w:r>
-      <w:r>
-        <w:t>, dashboard data.</w:t>
+        <w:t xml:space="preserve"> for due-date calculations and session management, dashboard data.</w:t>
       </w:r>
     </w:p>
     <w:p>
@@ -4346,10 +4334,7 @@
         <w:t>PDF Generation:</w:t>
       </w:r>
       <w:r>
-        <w:t xml:space="preserve"> </w:t>
-      </w:r>
-      <w:r>
-        <w:t>Puppeteer</w:t>
+        <w:t xml:space="preserve"> Puppeteer</w:t>
       </w:r>
     </w:p>
     <w:p>
@@ -4368,10 +4353,7 @@
         <w:t>Auth:</w:t>
       </w:r>
       <w:r>
-        <w:t xml:space="preserve"> </w:t>
-      </w:r>
-      <w:r>
-        <w:t>JWT with RBAC middleware</w:t>
+        <w:t xml:space="preserve"> JWT with RBAC middleware</w:t>
       </w:r>
     </w:p>
     <w:p>
@@ -4400,16 +4382,7 @@
         <w:t xml:space="preserve"> Docker on local premise</w:t>
       </w:r>
       <w:r>
-        <w:t xml:space="preserve"> + docker compose, </w:t>
-      </w:r>
-      <w:r>
-        <w:t>Nginx as reverse proxy</w:t>
-      </w:r>
-      <w:r>
-        <w:t xml:space="preserve">, </w:t>
-      </w:r>
-      <w:r>
-        <w:t>Redis for caching/sessions</w:t>
+        <w:t xml:space="preserve"> + docker compose, Nginx as reverse proxy, Redis for caching/sessions</w:t>
       </w:r>
     </w:p>
     <w:p>
@@ -4526,7 +4499,7 @@
     <w:p>
       <w:r>
         <w:pict w14:anchorId="3FEAF26A">
-          <v:rect id="_x0000_i1124" style="width:384.85pt;height:1.5pt" o:hrpct="0" o:hralign="center" o:hrstd="t" o:hr="t" fillcolor="#a0a0a0" stroked="f"/>
+          <v:rect id="_x0000_i1028" style="width:384.85pt;height:1.5pt" o:hrpct="0" o:hralign="center" o:hrstd="t" o:hr="t" fillcolor="#a0a0a0" stroked="f"/>
         </w:pict>
       </w:r>
     </w:p>
@@ -4701,17 +4674,8 @@
           <w:lang w:eastAsia="en-IN"/>
           <w14:ligatures w14:val="none"/>
         </w:rPr>
-        <w:t xml:space="preserve">Split screen: Form (left) + PDF preview (right) </w:t>
-      </w:r>
-    </w:p>
-    <w:p>
-      <w:pPr>
-        <w:pStyle w:val="ListParagraph"/>
-        <w:numPr>
-          <w:ilvl w:val="0"/>
-          <w:numId w:val="7"/>
-        </w:numPr>
-      </w:pPr>
+        <w:t>Split screen: Form (</w:t>
+      </w:r>
       <w:r>
         <w:rPr>
           <w:rFonts w:ascii="Times New Roman" w:eastAsia="Times New Roman" w:hAnsi="Times New Roman" w:cs="Times New Roman"/>
@@ -4721,6 +4685,61 @@
           <w:lang w:eastAsia="en-IN"/>
           <w14:ligatures w14:val="none"/>
         </w:rPr>
+        <w:t>right</w:t>
+      </w:r>
+      <w:r>
+        <w:rPr>
+          <w:rFonts w:ascii="Times New Roman" w:eastAsia="Times New Roman" w:hAnsi="Times New Roman" w:cs="Times New Roman"/>
+          <w:kern w:val="0"/>
+          <w:sz w:val="24"/>
+          <w:szCs w:val="24"/>
+          <w:lang w:eastAsia="en-IN"/>
+          <w14:ligatures w14:val="none"/>
+        </w:rPr>
+        <w:t>) + PDF preview (</w:t>
+      </w:r>
+      <w:r>
+        <w:rPr>
+          <w:rFonts w:ascii="Times New Roman" w:eastAsia="Times New Roman" w:hAnsi="Times New Roman" w:cs="Times New Roman"/>
+          <w:kern w:val="0"/>
+          <w:sz w:val="24"/>
+          <w:szCs w:val="24"/>
+          <w:lang w:eastAsia="en-IN"/>
+          <w14:ligatures w14:val="none"/>
+        </w:rPr>
+        <w:t>left</w:t>
+      </w:r>
+      <w:bookmarkStart w:id="0" w:name="_GoBack"/>
+      <w:bookmarkEnd w:id="0"/>
+      <w:r>
+        <w:rPr>
+          <w:rFonts w:ascii="Times New Roman" w:eastAsia="Times New Roman" w:hAnsi="Times New Roman" w:cs="Times New Roman"/>
+          <w:kern w:val="0"/>
+          <w:sz w:val="24"/>
+          <w:szCs w:val="24"/>
+          <w:lang w:eastAsia="en-IN"/>
+          <w14:ligatures w14:val="none"/>
+        </w:rPr>
+        <w:t xml:space="preserve">) </w:t>
+      </w:r>
+    </w:p>
+    <w:p>
+      <w:pPr>
+        <w:pStyle w:val="ListParagraph"/>
+        <w:numPr>
+          <w:ilvl w:val="0"/>
+          <w:numId w:val="7"/>
+        </w:numPr>
+      </w:pPr>
+      <w:r>
+        <w:rPr>
+          <w:rFonts w:ascii="Times New Roman" w:eastAsia="Times New Roman" w:hAnsi="Times New Roman" w:cs="Times New Roman"/>
+          <w:kern w:val="0"/>
+          <w:sz w:val="24"/>
+          <w:szCs w:val="24"/>
+          <w:lang w:eastAsia="en-IN"/>
+          <w14:ligatures w14:val="none"/>
+        </w:rPr>
         <w:t>Capture: SAP ID, training name, start date, end date</w:t>
       </w:r>
     </w:p>
@@ -5144,13 +5163,7 @@
         </w:rPr>
       </w:pPr>
       <w:r>
-        <w:t>7</w:t>
-      </w:r>
-      <w:r>
-        <w:t>)</w:t>
-      </w:r>
-      <w:r>
-        <w:t xml:space="preserve">. </w:t>
+        <w:t xml:space="preserve">7). </w:t>
       </w:r>
       <w:r>
         <w:rPr>
@@ -6734,7 +6747,7 @@
 </file>
 
 <file path=word/numbering.xml><?xml version="1.0" encoding="utf-8"?>
-<w:numbering xmlns:wpc="http://schemas.microsoft.com/office/word/2010/wordprocessingCanvas" xmlns:cx="http://schemas.microsoft.com/office/drawing/2014/chartex" xmlns:cx1="http://schemas.microsoft.com/office/drawing/2015/9/8/chartex" xmlns:cx2="http://schemas.microsoft.com/office/drawing/2015/10/21/chartex" xmlns:cx3="http://schemas.microsoft.com/office/drawing/2016/5/9/chartex" xmlns:cx4="http://schemas.microsoft.com/office/drawing/2016/5/10/chartex" xmlns:cx5="http://schemas.microsoft.com/office/drawing/2016/5/11/chartex" xmlns:cx6="http://schemas.microsoft.com/office/drawing/2016/5/12/chartex" xmlns:cx7="http://schemas.microsoft.com/office/drawing/2016/5/13/chartex" xmlns:cx8="http://schemas.microsoft.com/office/drawing/2016/5/14/chartex" xmlns:mc="http://schemas.openxmlformats.org/markup-compatibility/2006" xmlns:aink="http://schemas.microsoft.com/office/drawing/2016/ink" xmlns:am3d="http://schemas.microsoft.com/office/drawing/2017/model3d" xmlns:o="urn:schemas-microsoft-com:office:office" xmlns:oel="http://schemas.microsoft.com/office/2019/extlst" xmlns:r="http://schemas.openxmlformats.org/officeDocument/2006/relationships" xmlns:m="http://schemas.openxmlformats.org/officeDocument/2006/math" xmlns:v="urn:schemas-microsoft-com:vml" xmlns:wp14="http://schemas.microsoft.com/office/word/2010/wordprocessingDrawing" xmlns:wp="http://schemas.openxmlformats.org/drawingml/2006/wordprocessingDrawing" xmlns:w10="urn:schemas-microsoft-com:office:word" xmlns:w="http://schemas.openxmlformats.org/wordprocessingml/2006/main" xmlns:w14="http://schemas.microsoft.com/office/word/2010/wordml" xmlns:w15="http://schemas.microsoft.com/office/word/2012/wordml" xmlns:w16cex="http://schemas.microsoft.com/office/word/2018/wordml/cex" xmlns:w16cid="http://schemas.microsoft.com/office/word/2016/wordml/cid" xmlns:w16="http://schemas.microsoft.com/office/word/2018/wordml" xmlns:w16du="http://schemas.microsoft.com/office/word/2023/wordml/word16du" xmlns:w16sdtdh="http://schemas.microsoft.com/office/word/2020/wordml/sdtdatahash" xmlns:w16se="http://schemas.microsoft.com/office/word/2015/wordml/symex" xmlns:wpg="http://schemas.microsoft.com/office/word/2010/wordprocessingGroup" xmlns:wpi="http://schemas.microsoft.com/office/word/2010/wordprocessingInk" xmlns:wne="http://schemas.microsoft.com/office/word/2006/wordml" xmlns:wps="http://schemas.microsoft.com/office/word/2010/wordprocessingShape" mc:Ignorable="w14 w15 w16se w16cid w16 w16cex w16sdtdh w16du wp14">
+<w:numbering xmlns:wpc="http://schemas.microsoft.com/office/word/2010/wordprocessingCanvas" xmlns:cx="http://schemas.microsoft.com/office/drawing/2014/chartex" xmlns:cx1="http://schemas.microsoft.com/office/drawing/2015/9/8/chartex" xmlns:cx2="http://schemas.microsoft.com/office/drawing/2015/10/21/chartex" xmlns:cx3="http://schemas.microsoft.com/office/drawing/2016/5/9/chartex" xmlns:cx4="http://schemas.microsoft.com/office/drawing/2016/5/10/chartex" xmlns:cx5="http://schemas.microsoft.com/office/drawing/2016/5/11/chartex" xmlns:cx6="http://schemas.microsoft.com/office/drawing/2016/5/12/chartex" xmlns:cx7="http://schemas.microsoft.com/office/drawing/2016/5/13/chartex" xmlns:cx8="http://schemas.microsoft.com/office/drawing/2016/5/14/chartex" xmlns:mc="http://schemas.openxmlformats.org/markup-compatibility/2006" xmlns:aink="http://schemas.microsoft.com/office/drawing/2016/ink" xmlns:am3d="http://schemas.microsoft.com/office/drawing/2017/model3d" xmlns:o="urn:schemas-microsoft-com:office:office" xmlns:r="http://schemas.openxmlformats.org/officeDocument/2006/relationships" xmlns:m="http://schemas.openxmlformats.org/officeDocument/2006/math" xmlns:v="urn:schemas-microsoft-com:vml" xmlns:wp14="http://schemas.microsoft.com/office/word/2010/wordprocessingDrawing" xmlns:wp="http://schemas.openxmlformats.org/drawingml/2006/wordprocessingDrawing" xmlns:w10="urn:schemas-microsoft-com:office:word" xmlns:w="http://schemas.openxmlformats.org/wordprocessingml/2006/main" xmlns:w14="http://schemas.microsoft.com/office/word/2010/wordml" xmlns:w15="http://schemas.microsoft.com/office/word/2012/wordml" xmlns:w16cid="http://schemas.microsoft.com/office/word/2016/wordml/cid" xmlns:w16se="http://schemas.microsoft.com/office/word/2015/wordml/symex" xmlns:wpg="http://schemas.microsoft.com/office/word/2010/wordprocessingGroup" xmlns:wpi="http://schemas.microsoft.com/office/word/2010/wordprocessingInk" xmlns:wne="http://schemas.microsoft.com/office/word/2006/wordml" xmlns:wps="http://schemas.microsoft.com/office/word/2010/wordprocessingShape" mc:Ignorable="w14 w15 w16se w16cid wp14">
   <w:abstractNum w:abstractNumId="0" w15:restartNumberingAfterBreak="0">
     <w:nsid w:val="0E6A3AB8"/>
     <w:multiLevelType w:val="hybridMultilevel"/>
@@ -8395,50 +8408,50 @@
       </w:rPr>
     </w:lvl>
   </w:abstractNum>
-  <w:num w:numId="1" w16cid:durableId="1318875906">
+  <w:num w:numId="1">
     <w:abstractNumId w:val="8"/>
   </w:num>
-  <w:num w:numId="2" w16cid:durableId="488058500">
+  <w:num w:numId="2">
     <w:abstractNumId w:val="10"/>
   </w:num>
-  <w:num w:numId="3" w16cid:durableId="212933722">
+  <w:num w:numId="3">
     <w:abstractNumId w:val="3"/>
   </w:num>
-  <w:num w:numId="4" w16cid:durableId="168563217">
+  <w:num w:numId="4">
     <w:abstractNumId w:val="11"/>
   </w:num>
-  <w:num w:numId="5" w16cid:durableId="844900850">
+  <w:num w:numId="5">
     <w:abstractNumId w:val="6"/>
   </w:num>
-  <w:num w:numId="6" w16cid:durableId="1964801795">
+  <w:num w:numId="6">
     <w:abstractNumId w:val="7"/>
   </w:num>
-  <w:num w:numId="7" w16cid:durableId="304242321">
+  <w:num w:numId="7">
     <w:abstractNumId w:val="1"/>
   </w:num>
-  <w:num w:numId="8" w16cid:durableId="846287645">
+  <w:num w:numId="8">
     <w:abstractNumId w:val="5"/>
   </w:num>
-  <w:num w:numId="9" w16cid:durableId="1408764266">
+  <w:num w:numId="9">
     <w:abstractNumId w:val="12"/>
   </w:num>
-  <w:num w:numId="10" w16cid:durableId="2086759041">
+  <w:num w:numId="10">
     <w:abstractNumId w:val="2"/>
   </w:num>
-  <w:num w:numId="11" w16cid:durableId="1689597717">
+  <w:num w:numId="11">
     <w:abstractNumId w:val="9"/>
   </w:num>
-  <w:num w:numId="12" w16cid:durableId="1628851683">
+  <w:num w:numId="12">
     <w:abstractNumId w:val="4"/>
   </w:num>
-  <w:num w:numId="13" w16cid:durableId="752748947">
+  <w:num w:numId="13">
     <w:abstractNumId w:val="0"/>
   </w:num>
 </w:numbering>
 </file>
 
 <file path=word/styles.xml><?xml version="1.0" encoding="utf-8"?>
-<w:styles xmlns:mc="http://schemas.openxmlformats.org/markup-compatibility/2006" xmlns:r="http://schemas.openxmlformats.org/officeDocument/2006/relationships" xmlns:w="http://schemas.openxmlformats.org/wordprocessingml/2006/main" xmlns:w14="http://schemas.microsoft.com/office/word/2010/wordml" xmlns:w15="http://schemas.microsoft.com/office/word/2012/wordml" xmlns:w16cex="http://schemas.microsoft.com/office/word/2018/wordml/cex" xmlns:w16cid="http://schemas.microsoft.com/office/word/2016/wordml/cid" xmlns:w16="http://schemas.microsoft.com/office/word/2018/wordml" xmlns:w16du="http://schemas.microsoft.com/office/word/2023/wordml/word16du" xmlns:w16sdtdh="http://schemas.microsoft.com/office/word/2020/wordml/sdtdatahash" xmlns:w16se="http://schemas.microsoft.com/office/word/2015/wordml/symex" mc:Ignorable="w14 w15 w16se w16cid w16 w16cex w16sdtdh w16du">
+<w:styles xmlns:mc="http://schemas.openxmlformats.org/markup-compatibility/2006" xmlns:r="http://schemas.openxmlformats.org/officeDocument/2006/relationships" xmlns:w="http://schemas.openxmlformats.org/wordprocessingml/2006/main" xmlns:w14="http://schemas.microsoft.com/office/word/2010/wordml" xmlns:w15="http://schemas.microsoft.com/office/word/2012/wordml" xmlns:w16cid="http://schemas.microsoft.com/office/word/2016/wordml/cid" xmlns:w16se="http://schemas.microsoft.com/office/word/2015/wordml/symex" mc:Ignorable="w14 w15 w16se w16cid">
   <w:docDefaults>
     <w:rPrDefault>
       <w:rPr>
@@ -8456,7 +8469,7 @@
       </w:pPr>
     </w:pPrDefault>
   </w:docDefaults>
-  <w:latentStyles w:defLockedState="0" w:defUIPriority="99" w:defSemiHidden="0" w:defUnhideWhenUsed="0" w:defQFormat="0" w:count="376">
+  <w:latentStyles w:defLockedState="0" w:defUIPriority="99" w:defSemiHidden="0" w:defUnhideWhenUsed="0" w:defQFormat="0" w:count="375">
     <w:lsdException w:name="Normal" w:uiPriority="0" w:qFormat="1"/>
     <w:lsdException w:name="heading 1" w:uiPriority="9" w:qFormat="1"/>
     <w:lsdException w:name="heading 2" w:semiHidden="1" w:uiPriority="9" w:unhideWhenUsed="1" w:qFormat="1"/>
@@ -8832,7 +8845,6 @@
     <w:lsdException w:name="Smart Hyperlink" w:semiHidden="1" w:unhideWhenUsed="1"/>
     <w:lsdException w:name="Hashtag" w:semiHidden="1" w:unhideWhenUsed="1"/>
     <w:lsdException w:name="Unresolved Mention" w:semiHidden="1" w:unhideWhenUsed="1"/>
-    <w:lsdException w:name="Smart Link" w:semiHidden="1" w:unhideWhenUsed="1"/>
   </w:latentStyles>
   <w:style w:type="paragraph" w:default="1" w:styleId="Normal">
     <w:name w:val="Normal"/>
@@ -8841,6 +8853,7 @@
   <w:style w:type="character" w:default="1" w:styleId="DefaultParagraphFont">
     <w:name w:val="Default Paragraph Font"/>
     <w:uiPriority w:val="1"/>
+    <w:semiHidden/>
     <w:unhideWhenUsed/>
   </w:style>
   <w:style w:type="table" w:default="1" w:styleId="TableNormal">

</xml_diff>